<commit_message>
Intégration de l'introduction générale ReadyToGo
Ajout du texte validé de l'introduction après le sommaire,
avec mise en forme académique et emplacement figure suggéré.

Co-authored-by: Sadour Ilyas <sadour2004@users.noreply.github.com>
</commit_message>
<xml_diff>
--- a/rapport-readytogo/ReadyToGo_Rapport_Management_Projet.docx
+++ b/rapport-readytogo/ReadyToGo_Rapport_Management_Projet.docx
@@ -3854,6 +3854,8 @@
     <w:p>
       <w:pPr>
         <w:pStyle w:val="Heading1"/>
+        <w:spacing w:before="0" w:after="240" w:lineRule="auto" w:line="360"/>
+        <w:jc w:val="left"/>
       </w:pPr>
       <w:r>
         <w:rPr>
@@ -3868,34 +3870,162 @@
     </w:p>
     <w:p>
       <w:pPr>
-        <w:spacing w:before="0" w:after="120" w:lineRule="auto" w:line="360"/>
-        <w:ind w:firstLine="0"/>
+        <w:spacing w:before="0" w:after="200" w:lineRule="auto" w:line="360"/>
+        <w:ind w:firstLine="425"/>
         <w:jc w:val="both"/>
+      </w:pPr>
+      <w:r>
+        <w:rPr>
+          <w:rFonts w:ascii="Times New Roman" w:hAnsi="Times New Roman" w:eastAsia="Times New Roman"/>
+          <w:b w:val="0"/>
+          <w:i w:val="0"/>
+          <w:sz w:val="24"/>
+        </w:rPr>
+        <w:t>La mobilité urbaine constitue aujourd’hui l’un des enjeux majeurs des grandes villes marocaines. Avec l’augmentation du nombre de véhicules, la croissance démographique, le développement touristique et l’élargissement des activités économiques, les déplacements quotidiens deviennent de plus en plus complexes. La ville de Tanger, en raison de sa position stratégique, de son dynamisme économique et de son attractivité touristique, connaît une pression croissante sur ses infrastructures de transport.</w:t>
+      </w:r>
+    </w:p>
+    <w:p>
+      <w:pPr>
+        <w:spacing w:before="0" w:after="200" w:lineRule="auto" w:line="360"/>
+        <w:ind w:firstLine="425"/>
+        <w:jc w:val="both"/>
+      </w:pPr>
+      <w:r>
+        <w:rPr>
+          <w:rFonts w:ascii="Times New Roman" w:hAnsi="Times New Roman" w:eastAsia="Times New Roman"/>
+          <w:b w:val="0"/>
+          <w:i w:val="0"/>
+          <w:sz w:val="24"/>
+        </w:rPr>
+        <w:t>Dans ce contexte, la circulation urbaine représente un défi important pour les habitants, les étudiants, les travailleurs, les visiteurs et les touristes. Les embouteillages, la difficulté de stationnement, le temps perdu dans les déplacements et la saturation de certains axes réduisent la qualité de vie urbaine et peuvent freiner l’efficacité des déplacements. Cette situation devient encore plus importante dans la perspective de la Coupe du Monde 2030, événement international qui impliquera une forte hausse des flux de visiteurs, notamment dans les villes marocaines concernées par l’accueil et l’organisation de l’événement.</w:t>
+      </w:r>
+    </w:p>
+    <w:p>
+      <w:pPr>
+        <w:spacing w:before="0" w:after="200" w:lineRule="auto" w:line="360"/>
+        <w:ind w:firstLine="425"/>
+        <w:jc w:val="both"/>
+      </w:pPr>
+      <w:r>
+        <w:rPr>
+          <w:rFonts w:ascii="Times New Roman" w:hAnsi="Times New Roman" w:eastAsia="Times New Roman"/>
+          <w:b w:val="0"/>
+          <w:i w:val="0"/>
+          <w:sz w:val="24"/>
+        </w:rPr>
+        <w:t>Le projet ReadyToGo s’inscrit dans cette réflexion. Il propose la mise en place d’un service de trottinettes électriques en libre-service à Tanger, afin d’offrir une solution de mobilité courte distance, flexible, rapide, accessible et respectueuse de l’environnement. L’idée initiale du projet repose sur un constat simple : certains trajets urbains, notamment entre le centre-ville, la corniche, la gare, les zones hôtelières et les lieux à forte fréquentation, peuvent être réalisés plus efficacement avec une solution de micromobilité qu’avec une voiture ou un taxi en période de congestion. La fiche initiale du projet met déjà en avant cette logique de complémentarité avec les transports existants, notamment le bus, les taxis et les infrastructures prévues autour de Tanger.</w:t>
+      </w:r>
+    </w:p>
+    <w:p>
+      <w:pPr>
+        <w:spacing w:before="0" w:after="200" w:lineRule="auto" w:line="360"/>
+        <w:ind w:firstLine="425"/>
+        <w:jc w:val="both"/>
+      </w:pPr>
+      <w:r>
+        <w:rPr>
+          <w:rFonts w:ascii="Times New Roman" w:hAnsi="Times New Roman" w:eastAsia="Times New Roman"/>
+          <w:b w:val="0"/>
+          <w:i w:val="0"/>
+          <w:sz w:val="24"/>
+        </w:rPr>
+        <w:t>ReadyToGo ne vise donc pas à remplacer les moyens de transport existants. Il s’agit plutôt d’une solution complémentaire destinée à améliorer la fluidité des déplacements, particulièrement sur les derniers kilomètres. Le service permettrait aux utilisateurs de localiser une trottinette via une application mobile, de la déverrouiller à l’aide d’un QR code, d’effectuer leur trajet, puis de la déposer dans une zone autorisée. Le fonctionnement quotidien du service repose sur une flotte de trottinettes électriques, des bornes ou zones de stationnement, une application mobile, une équipe de maintenance, un système de recharge et un tableau de bord de suivi opérationnel.</w:t>
+      </w:r>
+    </w:p>
+    <w:p>
+      <w:pPr>
+        <w:spacing w:before="0" w:after="200" w:lineRule="auto" w:line="360"/>
+        <w:ind w:firstLine="425"/>
+        <w:jc w:val="both"/>
+      </w:pPr>
+      <w:r>
+        <w:rPr>
+          <w:rFonts w:ascii="Times New Roman" w:hAnsi="Times New Roman" w:eastAsia="Times New Roman"/>
+          <w:b w:val="0"/>
+          <w:i w:val="0"/>
+          <w:sz w:val="24"/>
+        </w:rPr>
+        <w:t>Ce projet présente également une dimension stratégique. Dans la perspective de 2030, Tanger devra renforcer son image de ville moderne, accessible et capable d’accueillir des flux importants de visiteurs. Un service comme ReadyToGo peut contribuer à cette ambition en offrant une expérience de déplacement simple pour les habitants comme pour les touristes. Les pass journée, les pass semaine, les tarifs étudiants, la signalétique multilingue et les zones connectées aux pôles de transport peuvent donner au projet une valeur ajoutée particulière.</w:t>
+      </w:r>
+    </w:p>
+    <w:p>
+      <w:pPr>
+        <w:spacing w:before="0" w:after="200" w:lineRule="auto" w:line="360"/>
+        <w:ind w:firstLine="425"/>
+        <w:jc w:val="both"/>
+      </w:pPr>
+      <w:r>
+        <w:rPr>
+          <w:rFonts w:ascii="Times New Roman" w:hAnsi="Times New Roman" w:eastAsia="Times New Roman"/>
+          <w:b w:val="0"/>
+          <w:i w:val="0"/>
+          <w:sz w:val="24"/>
+        </w:rPr>
+        <w:t>Sur le plan académique, ReadyToGo constitue un cas pertinent pour appliquer les notions fondamentales du management de projet. En effet, il s’agit d’un projet temporaire, avec un début, une fin, des objectifs précis, des contraintes de coût, de délai et de qualité, des parties prenantes multiples et des livrables concrets. Le support du cours rappelle qu’un projet doit être construit progressivement à travers plusieurs étapes : cadrage, planification, gestion des risques, suivi, communication et livraison finale.</w:t>
+      </w:r>
+    </w:p>
+    <w:p>
+      <w:pPr>
+        <w:spacing w:before="0" w:after="200" w:lineRule="auto" w:line="360"/>
+        <w:ind w:firstLine="425"/>
+        <w:jc w:val="both"/>
+      </w:pPr>
+      <w:r>
+        <w:rPr>
+          <w:rFonts w:ascii="Times New Roman" w:hAnsi="Times New Roman" w:eastAsia="Times New Roman"/>
+          <w:b w:val="0"/>
+          <w:i w:val="0"/>
+          <w:sz w:val="24"/>
+        </w:rPr>
+        <w:t>Le présent rapport a donc pour objectif de présenter ReadyToGo comme un projet structuré de management. Il ne se limite pas à décrire une idée commerciale. Il vise à montrer comment cette idée peut être transformée en projet réalisable, pilotable et évaluable. Pour cela, le rapport abordera successivement la présentation du projet, son cadrage, ses objectifs SMART, son périmètre, ses parties prenantes, sa méthodologie de gestion, sa planification, son budget, ses risques, ses indicateurs de suivi, sa stratégie de communication, ses scénarios d’utilisation et sa clôture.</w:t>
+      </w:r>
+    </w:p>
+    <w:p>
+      <w:pPr>
+        <w:spacing w:before="0" w:after="200" w:lineRule="auto" w:line="360"/>
+        <w:ind w:firstLine="425"/>
+        <w:jc w:val="both"/>
+      </w:pPr>
+      <w:r>
+        <w:rPr>
+          <w:rFonts w:ascii="Times New Roman" w:hAnsi="Times New Roman" w:eastAsia="Times New Roman"/>
+          <w:b w:val="0"/>
+          <w:i w:val="0"/>
+          <w:sz w:val="24"/>
+        </w:rPr>
+        <w:t>La démarche retenue est une approche hybride. La partie stratégique du projet, notamment le cadrage, les autorisations, le budget, les contrats, l’installation des bornes et la gouvernance, nécessite une organisation classique et structurée. En revanche, le développement de l’application mobile, les tests utilisateurs, l’amélioration du service et l’ajustement des fonctionnalités nécessitent une approche agile. Cette combinaison permet de bénéficier à la fois de la rigueur du management classique et de la flexibilité des méthodes agiles.</w:t>
+      </w:r>
+    </w:p>
+    <w:p>
+      <w:pPr>
+        <w:spacing w:before="0" w:after="200" w:lineRule="auto" w:line="360"/>
+        <w:ind w:firstLine="425"/>
+        <w:jc w:val="both"/>
+      </w:pPr>
+      <w:r>
+        <w:rPr>
+          <w:rFonts w:ascii="Times New Roman" w:hAnsi="Times New Roman" w:eastAsia="Times New Roman"/>
+          <w:b w:val="0"/>
+          <w:i w:val="0"/>
+          <w:sz w:val="24"/>
+        </w:rPr>
+        <w:t>Ainsi, ReadyToGo apparaît comme un projet à la fois urbain, technologique, économique et environnemental. Il répond à un besoin concret de mobilité, tout en offrant un terrain d’application complet pour les outils de management de projet étudiés dans le cadre du cours.</w:t>
+      </w:r>
+    </w:p>
+    <w:p>
+      <w:pPr>
+        <w:spacing w:before="320" w:after="80" w:lineRule="auto" w:line="360"/>
+        <w:jc w:val="center"/>
       </w:pPr>
       <w:r>
         <w:rPr>
           <w:rFonts w:ascii="Times New Roman" w:hAnsi="Times New Roman" w:eastAsia="Times New Roman"/>
           <w:b w:val="0"/>
           <w:i/>
-          <w:sz w:val="24"/>
+          <w:color w:val="888888"/>
+          <w:sz w:val="18"/>
         </w:rPr>
-        <w:t>Information à compléter</w:t>
-      </w:r>
-    </w:p>
-    <w:p>
-      <w:pPr>
-        <w:spacing w:before="240" w:after="120" w:lineRule="auto" w:line="360"/>
-        <w:jc w:val="both"/>
-      </w:pPr>
-      <w:r>
-        <w:rPr>
-          <w:rFonts w:ascii="Times New Roman" w:hAnsi="Times New Roman" w:eastAsia="Times New Roman"/>
-          <w:b w:val="0"/>
-          <w:i/>
-          <w:color w:val="666666"/>
-          <w:sz w:val="20"/>
-        </w:rPr>
-        <w:t>[Le corps du rapport (introduction et chapitres) sera intégré progressivement au fur et à mesure de la réception du contenu validé, page par page.]</w:t>
+        <w:t>[Emplacement suggéré — Figure : schéma de positionnement de ReadyToGo dans l’écosystème de mobilité urbaine à Tanger (complémentarité bus / taxis / micromobilité)]</w:t>
       </w:r>
     </w:p>
     <w:sectPr>

</xml_diff>